<commit_message>
Proyecto herramientas de diseño, metodologia
</commit_message>
<xml_diff>
--- a/documentacion_Marce_Damian.docx
+++ b/documentacion_Marce_Damian.docx
@@ -194,6 +194,7 @@
           <w:szCs w:val="24"/>
         </w:rPr>
       </w:pPr>
+      <w:bookmarkStart w:id="0" w:name="_Hlk243000134"/>
       <w:r>
         <w:rPr>
           <w:rFonts w:cs="Arial"/>
@@ -222,6 +223,7 @@
         <w:t>en la ciudad de Caacupé en el año 2026</w:t>
       </w:r>
     </w:p>
+    <w:bookmarkEnd w:id="0"/>
     <w:p>
       <w:pPr>
         <w:pStyle w:val="Sinespaciado"/>
@@ -729,15 +731,50 @@
       <w:pPr>
         <w:rPr>
           <w:rFonts w:cs="Arial"/>
-          <w:szCs w:val="24"/>
-        </w:rPr>
-      </w:pPr>
-      <w:r>
-        <w:rPr>
-          <w:rFonts w:cs="Arial"/>
-          <w:szCs w:val="24"/>
-        </w:rPr>
-        <w:t>//Aquí va el tema y luego el título por separado y especificado como en la portada</w:t>
+          <w:bCs/>
+          <w:szCs w:val="24"/>
+        </w:rPr>
+      </w:pPr>
+      <w:r>
+        <w:rPr>
+          <w:rFonts w:cs="Arial"/>
+          <w:szCs w:val="24"/>
+        </w:rPr>
+        <w:t>Tema:</w:t>
+      </w:r>
+      <w:r>
+        <w:rPr>
+          <w:rFonts w:cs="Arial"/>
+          <w:bCs/>
+          <w:szCs w:val="24"/>
+        </w:rPr>
+        <w:t xml:space="preserve"> Sistema web de gestión de productos</w:t>
+      </w:r>
+    </w:p>
+    <w:p>
+      <w:pPr>
+        <w:pStyle w:val="Sinespaciado"/>
+        <w:rPr>
+          <w:rFonts w:cs="Arial"/>
+          <w:bCs/>
+          <w:szCs w:val="24"/>
+        </w:rPr>
+      </w:pPr>
+      <w:r>
+        <w:rPr>
+          <w:rFonts w:cs="Arial"/>
+          <w:bCs/>
+          <w:szCs w:val="24"/>
+        </w:rPr>
+        <w:t>Título:</w:t>
+      </w:r>
+      <w:r>
+        <w:rPr>
+          <w:rFonts w:cs="Arial"/>
+          <w:bCs/>
+          <w:szCs w:val="24"/>
+        </w:rPr>
+        <w:t xml:space="preserve"> Sistema web de gestión de productos para chabelitaStorepy-Boutique, en la ciudad de Caacupé en el año 2026</w:t>
       </w:r>
     </w:p>
     <w:p>
@@ -1042,11 +1079,28 @@
           <w:szCs w:val="24"/>
         </w:rPr>
       </w:pPr>
-      <w:r>
-        <w:rPr>
-          <w:rFonts w:cs="Arial"/>
-          <w:szCs w:val="24"/>
-        </w:rPr>
+    </w:p>
+    <w:p>
+      <w:pPr>
+        <w:rPr>
+          <w:rFonts w:cs="Arial"/>
+          <w:szCs w:val="24"/>
+        </w:rPr>
+      </w:pPr>
+    </w:p>
+    <w:p>
+      <w:pPr>
+        <w:rPr>
+          <w:rFonts w:cs="Arial"/>
+          <w:szCs w:val="24"/>
+        </w:rPr>
+      </w:pPr>
+      <w:r>
+        <w:rPr>
+          <w:rFonts w:cs="Arial"/>
+          <w:szCs w:val="24"/>
+        </w:rPr>
+        <w:lastRenderedPageBreak/>
         <w:t>4- OBJETIVOS</w:t>
       </w:r>
     </w:p>
@@ -1101,7 +1155,6 @@
           <w:rFonts w:cs="Arial"/>
           <w:szCs w:val="24"/>
         </w:rPr>
-        <w:lastRenderedPageBreak/>
         <w:tab/>
         <w:t>4.2- OBJETIVOS ESPECIFICOS</w:t>
       </w:r>
@@ -1324,7 +1377,28 @@
           <w:rFonts w:cs="Arial"/>
           <w:szCs w:val="24"/>
         </w:rPr>
-        <w:t xml:space="preserve">La presente investigación y desarrollo tecnológico se circunscribe espacialmente a la boutique chabelitaStorepy, ubicada en la ciudad de Caacupé, y temporalmente a la gestión del año 2026.   En cuanto a su alcance funcional, el proyecto se limitará única y exclusivamente a la construcción de un sistema web orientado a la gestión interna de productos y control de stock. Las funcionalidades abarcarán de manera estricta el registro, modificación y eliminación de productos, así como la detección de aquellos artículos que requieran reposición.   Por lo tanto, quedan excluidos del alcance de este trabajo el desarrollo de módulos de facturación o conexión con sistemas de facturación electrónica, puntos de venta directa </w:t>
+        <w:t xml:space="preserve">La presente investigación y desarrollo tecnológico se circunscribe espacialmente a la boutique chabelitaStorepy, ubicada en la ciudad de Caacupé, y temporalmente a la gestión del año 2026.   En cuanto a su alcance funcional, el proyecto se limitará única y exclusivamente a la construcción de un sistema web orientado a la gestión interna de productos y control de stock. Las funcionalidades abarcarán de manera estricta el registro, modificación y eliminación de productos, así como la detección de aquellos artículos que requieran reposición. </w:t>
+      </w:r>
+      <w:r>
+        <w:t xml:space="preserve">Además de la gestión principal de inventario, el sistema </w:t>
+      </w:r>
+      <w:r>
+        <w:lastRenderedPageBreak/>
+        <w:t>contará con un submódulo complementario para el registro básico de datos de contacto de clientes</w:t>
+      </w:r>
+      <w:r>
+        <w:rPr>
+          <w:rFonts w:cs="Arial"/>
+          <w:szCs w:val="24"/>
+        </w:rPr>
+        <w:t xml:space="preserve">. </w:t>
+      </w:r>
+      <w:r>
+        <w:rPr>
+          <w:rFonts w:cs="Arial"/>
+          <w:szCs w:val="24"/>
+        </w:rPr>
+        <w:t xml:space="preserve">Por lo tanto, quedan excluidos del alcance de este trabajo el desarrollo de módulos de facturación o conexión con sistemas de facturación electrónica, puntos de venta directa </w:t>
       </w:r>
       <w:r>
         <w:rPr>
@@ -1355,8 +1429,134 @@
           <w:szCs w:val="24"/>
         </w:rPr>
       </w:pPr>
-      <w:bookmarkStart w:id="0" w:name="_GoBack"/>
-      <w:bookmarkEnd w:id="0"/>
+    </w:p>
+    <w:p>
+      <w:pPr>
+        <w:rPr>
+          <w:rFonts w:cs="Arial"/>
+          <w:szCs w:val="24"/>
+        </w:rPr>
+      </w:pPr>
+      <w:r>
+        <w:rPr>
+          <w:rFonts w:cs="Arial"/>
+          <w:szCs w:val="24"/>
+        </w:rPr>
+        <w:t>8- IMPACTO DE LA INVESTIGACIÓN</w:t>
+      </w:r>
+    </w:p>
+    <w:p>
+      <w:pPr>
+        <w:rPr>
+          <w:rFonts w:cs="Arial"/>
+          <w:szCs w:val="24"/>
+        </w:rPr>
+      </w:pPr>
+      <w:r>
+        <w:rPr>
+          <w:rFonts w:cs="Arial"/>
+          <w:szCs w:val="24"/>
+        </w:rPr>
+        <w:t>El impacto principal de este proyecto se reflejará directamente en la modernización operativa y administrativa de la boutique chabelitaStorepy en la ciudad de Caacupé. Al reemplazar las herramientas manuales de registro por un sistema web automatizado, se generará un cambio cultural dentro del negocio, fomentando la adopción de la tecnología como pilar fundamental para el trabajo diario. Esto impactará positivamente en la rentabilidad del emprendimiento, ya que al tener un control de stock exacto y conocer en tiempo real los productos que necesitan reposición, se minimizarán las pérdidas por mercadería extraviada o ventas no concretadas por falta de inventario.</w:t>
+      </w:r>
+    </w:p>
+    <w:p>
+      <w:pPr>
+        <w:rPr>
+          <w:rFonts w:cs="Arial"/>
+          <w:szCs w:val="24"/>
+        </w:rPr>
+      </w:pPr>
+      <w:r>
+        <w:rPr>
+          <w:rFonts w:cs="Arial"/>
+          <w:szCs w:val="24"/>
+        </w:rPr>
+        <w:t>A nivel tecnológico y académico, la investigación demuestra cómo la aplicación práctica de la ingeniería de software puede brindar soluciones escalables a problemas reales del sector comercial local. El desarrollo de este sistema no solo beneficiará de manera exclusiva a la boutique en cuestión, sino que servirá como un caso de éxito y un modelo tecnológico de referencia. Demostrará que la sistematización de datos y la digitalización de inventarios son herramientas accesibles y cruciales para impulsar el crecimiento y la competitividad de las pequeñas y medianas empresas de la región.</w:t>
+      </w:r>
+    </w:p>
+    <w:p>
+      <w:pPr>
+        <w:rPr>
+          <w:rFonts w:cs="Arial"/>
+          <w:szCs w:val="24"/>
+        </w:rPr>
+      </w:pPr>
+    </w:p>
+    <w:p>
+      <w:pPr>
+        <w:rPr>
+          <w:rFonts w:cs="Arial"/>
+          <w:szCs w:val="24"/>
+        </w:rPr>
+      </w:pPr>
+      <w:r>
+        <w:rPr>
+          <w:rFonts w:cs="Arial"/>
+          <w:szCs w:val="24"/>
+        </w:rPr>
+        <w:t xml:space="preserve">CAPITULO II – MARCO TEÓRICO </w:t>
+      </w:r>
+    </w:p>
+    <w:p>
+      <w:pPr>
+        <w:rPr>
+          <w:rFonts w:cs="Arial"/>
+          <w:szCs w:val="24"/>
+        </w:rPr>
+      </w:pPr>
+      <w:r>
+        <w:rPr>
+          <w:rFonts w:cs="Arial"/>
+          <w:szCs w:val="24"/>
+        </w:rPr>
+        <w:t>1- MARCO CONCEPTUAL</w:t>
+      </w:r>
+    </w:p>
+    <w:p>
+      <w:pPr>
+        <w:rPr>
+          <w:rFonts w:cs="Arial"/>
+          <w:szCs w:val="24"/>
+        </w:rPr>
+      </w:pPr>
+      <w:r>
+        <w:rPr>
+          <w:rFonts w:cs="Arial"/>
+          <w:szCs w:val="24"/>
+        </w:rPr>
+        <w:t>El desarrollo e implementación de soluciones tecnológicas orientadas a la optimización de procesos comerciales requiere la articulación de fundamentos teóricos provenientes de la administración de operaciones y de la ingeniería de software. A continuación, se delimitan y sustentan los conceptos esenciales que rigen la construcción del sistema objeto de estudio.</w:t>
+      </w:r>
+    </w:p>
+    <w:p>
+      <w:pPr>
+        <w:rPr>
+          <w:rFonts w:cs="Arial"/>
+          <w:szCs w:val="24"/>
+        </w:rPr>
+      </w:pPr>
+      <w:r>
+        <w:rPr>
+          <w:rFonts w:cs="Arial"/>
+          <w:szCs w:val="24"/>
+        </w:rPr>
+        <w:t>1.1. Gestión de Inventarios y Control de Stock en el Comercio Minorista</w:t>
+      </w:r>
+    </w:p>
+    <w:p>
+      <w:pPr>
+        <w:rPr>
+          <w:rFonts w:cs="Arial"/>
+          <w:szCs w:val="24"/>
+        </w:rPr>
+      </w:pPr>
+      <w:r>
+        <w:rPr>
+          <w:rFonts w:cs="Arial"/>
+          <w:szCs w:val="24"/>
+        </w:rPr>
+        <w:t>La gestión de inventarios se define como el conjunto de políticas, técnicas y procedimientos administrativos utilizados por una organización para supervisar el flujo de mercancías desde su ingreso hasta su disposición final. En empresas del sector minorista (boutiques), el inventario constituye el activo corriente más crítico, por lo que su correcta administración impacta directamente en la liquidez y continuidad del negocio.</w:t>
+      </w:r>
     </w:p>
     <w:p>
       <w:pPr>
@@ -1371,90 +1571,541 @@
           <w:szCs w:val="24"/>
         </w:rPr>
         <w:lastRenderedPageBreak/>
-        <w:t>8- IMPACTO DE LA INVESTIGACIÓN</w:t>
-      </w:r>
-    </w:p>
-    <w:p>
-      <w:pPr>
-        <w:rPr>
-          <w:rFonts w:cs="Arial"/>
-          <w:szCs w:val="24"/>
-        </w:rPr>
-      </w:pPr>
-      <w:r>
-        <w:rPr>
-          <w:rFonts w:cs="Arial"/>
-          <w:szCs w:val="24"/>
-        </w:rPr>
-        <w:t>El impacto principal de este proyecto se reflejará directamente en la modernización operativa y administrativa de la boutique chabelitaStorepy en la ciudad de Caacupé. Al reemplazar las herramientas manuales de registro por un sistema web automatizado, se generará un cambio cultural dentro del negocio, fomentando la adopción de la tecnología como pilar fundamental para el trabajo diario. Esto impactará positivamente en la rentabilidad del emprendimiento, ya que al tener un control de stock exacto y conocer en tiempo real los productos que necesitan reposición, se minimizarán las pérdidas por mercadería extraviada o ventas no concretadas por falta de inventario.</w:t>
-      </w:r>
-    </w:p>
-    <w:p>
-      <w:pPr>
-        <w:rPr>
-          <w:rFonts w:cs="Arial"/>
-          <w:szCs w:val="24"/>
-        </w:rPr>
-      </w:pPr>
-      <w:r>
-        <w:rPr>
-          <w:rFonts w:cs="Arial"/>
-          <w:szCs w:val="24"/>
-        </w:rPr>
-        <w:t>A nivel tecnológico y académico, la investigación demuestra cómo la aplicación práctica de la ingeniería de software puede brindar soluciones escalables a problemas reales del sector comercial local. El desarrollo de este sistema no solo beneficiará de manera exclusiva a la boutique en cuestión, sino que servirá como un caso de éxito y un modelo tecnológico de referencia. Demostrará que la sistematización de datos y la digitalización de inventarios son herramientas accesibles y cruciales para impulsar el crecimiento y la competitividad de las pequeñas y medianas empresas de la región.</w:t>
-      </w:r>
-    </w:p>
-    <w:p>
-      <w:pPr>
-        <w:rPr>
-          <w:rFonts w:cs="Arial"/>
-          <w:szCs w:val="24"/>
-        </w:rPr>
-      </w:pPr>
-    </w:p>
-    <w:p>
-      <w:pPr>
-        <w:rPr>
-          <w:rFonts w:cs="Arial"/>
-          <w:szCs w:val="24"/>
-        </w:rPr>
-      </w:pPr>
-      <w:r>
-        <w:rPr>
-          <w:rFonts w:cs="Arial"/>
-          <w:szCs w:val="24"/>
-        </w:rPr>
-        <w:t xml:space="preserve">CAPITULO II – MARCO TEÓRICO </w:t>
-      </w:r>
-    </w:p>
-    <w:p>
-      <w:pPr>
-        <w:rPr>
-          <w:rFonts w:cs="Arial"/>
-          <w:szCs w:val="24"/>
-        </w:rPr>
-      </w:pPr>
-      <w:r>
-        <w:rPr>
-          <w:rFonts w:cs="Arial"/>
-          <w:szCs w:val="24"/>
-        </w:rPr>
-        <w:t>1- MARCO CONCEPTUAL</w:t>
-      </w:r>
-    </w:p>
-    <w:p>
-      <w:pPr>
-        <w:rPr>
-          <w:rFonts w:cs="Arial"/>
-          <w:szCs w:val="24"/>
-        </w:rPr>
-      </w:pPr>
-      <w:r>
-        <w:rPr>
-          <w:rFonts w:cs="Arial"/>
-          <w:szCs w:val="24"/>
-        </w:rPr>
-        <w:t>// Se coloca el sustento teórico para la realización del trabajo de investigación y la descripción de las herramientas a desarrollar</w:t>
+        <w:t>* Sistemas de Gestión de Inventario: Son plataformas estructuradas que sustituyen los registros manuales por entornos digitales automatizados. Su propósito principal es mitigar la pérdida de información, eliminar la duplicación de datos y centralizar las operaciones de control de mercaderías para facilitar la toma de decisiones gerenciales.</w:t>
+      </w:r>
+    </w:p>
+    <w:p>
+      <w:pPr>
+        <w:rPr>
+          <w:rFonts w:cs="Arial"/>
+          <w:szCs w:val="24"/>
+        </w:rPr>
+      </w:pPr>
+      <w:r>
+        <w:rPr>
+          <w:rFonts w:cs="Arial"/>
+          <w:szCs w:val="24"/>
+        </w:rPr>
+        <w:t>* Control de Stock y Puntos de Reposición: El stock representa la cantidad de artículos acumulados que posee una empresa en un momento determinado. Para evitar el desabastecimiento o la sobrecompra, los sistemas automatizados emplean el concepto de punto de reposición. Este parámetro matemático determina el nivel mínimo de existencias en el que se debe generar una alerta o solicitud de nuevos productos, garantizando así la fluidez de las ventas y la precisión operativa de la boutique.</w:t>
+      </w:r>
+    </w:p>
+    <w:p>
+      <w:pPr>
+        <w:rPr>
+          <w:rFonts w:cs="Arial"/>
+          <w:szCs w:val="24"/>
+        </w:rPr>
+      </w:pPr>
+      <w:r>
+        <w:rPr>
+          <w:rFonts w:cs="Arial"/>
+          <w:szCs w:val="24"/>
+        </w:rPr>
+        <w:t>1.2. Operaciones CRUD (Crear, Leer, Actualizar y Borrar)</w:t>
+      </w:r>
+    </w:p>
+    <w:p>
+      <w:pPr>
+        <w:rPr>
+          <w:rFonts w:cs="Arial"/>
+          <w:szCs w:val="24"/>
+        </w:rPr>
+      </w:pPr>
+      <w:r>
+        <w:rPr>
+          <w:rFonts w:cs="Arial"/>
+          <w:szCs w:val="24"/>
+        </w:rPr>
+        <w:t>En el ámbito de la persistencia de datos, el acrónimo CRUD (del inglés Create, Read, Update, Delete) describe las cuatro funciones fundamentales que un software de gestión debe implementar para interactuar de forma completa con un repositorio de información.</w:t>
+      </w:r>
+    </w:p>
+    <w:p>
+      <w:pPr>
+        <w:rPr>
+          <w:rFonts w:cs="Arial"/>
+          <w:szCs w:val="24"/>
+        </w:rPr>
+      </w:pPr>
+      <w:r>
+        <w:rPr>
+          <w:rFonts w:cs="Arial"/>
+          <w:szCs w:val="24"/>
+        </w:rPr>
+        <w:t>* Registro (Create): Operación que permite introducir nuevos artículos al sistema, capturando variables iniciales como precios, categorías y descripciones.</w:t>
+      </w:r>
+    </w:p>
+    <w:p>
+      <w:pPr>
+        <w:rPr>
+          <w:rFonts w:cs="Arial"/>
+          <w:szCs w:val="24"/>
+        </w:rPr>
+      </w:pPr>
+      <w:r>
+        <w:rPr>
+          <w:rFonts w:cs="Arial"/>
+          <w:szCs w:val="24"/>
+        </w:rPr>
+        <w:t>* Almacenamiento y Lectura (Read): Capacidad del sistema para recuperar, consultar y desplegar en pantalla los datos de stock previamente guardados.</w:t>
+      </w:r>
+    </w:p>
+    <w:p>
+      <w:pPr>
+        <w:rPr>
+          <w:rFonts w:cs="Arial"/>
+          <w:szCs w:val="24"/>
+        </w:rPr>
+      </w:pPr>
+      <w:r>
+        <w:rPr>
+          <w:rFonts w:cs="Arial"/>
+          <w:szCs w:val="24"/>
+        </w:rPr>
+        <w:t>* Modificación (Update): Funcionalidad que facilita la edición de los atributos de un producto existente (por ejemplo, cambios de precio o talle) ante variaciones comerciales.</w:t>
+      </w:r>
+    </w:p>
+    <w:p>
+      <w:pPr>
+        <w:rPr>
+          <w:rFonts w:cs="Arial"/>
+          <w:szCs w:val="24"/>
+        </w:rPr>
+      </w:pPr>
+      <w:r>
+        <w:rPr>
+          <w:rFonts w:cs="Arial"/>
+          <w:szCs w:val="24"/>
+        </w:rPr>
+        <w:t>* Eliminación (Delete): Proceso de remoción lógica o física de un artículo que ha dejado de comercializarse o que fue registrado de manera errónea.</w:t>
+      </w:r>
+    </w:p>
+    <w:p>
+      <w:pPr>
+        <w:rPr>
+          <w:rFonts w:cs="Arial"/>
+          <w:szCs w:val="24"/>
+        </w:rPr>
+      </w:pPr>
+      <w:r>
+        <w:rPr>
+          <w:rFonts w:cs="Arial"/>
+          <w:szCs w:val="24"/>
+        </w:rPr>
+        <w:t>1.3. Ingeniería de Software y Arquitectura Web</w:t>
+      </w:r>
+    </w:p>
+    <w:p>
+      <w:pPr>
+        <w:rPr>
+          <w:rFonts w:cs="Arial"/>
+          <w:szCs w:val="24"/>
+        </w:rPr>
+      </w:pPr>
+      <w:r>
+        <w:rPr>
+          <w:rFonts w:cs="Arial"/>
+          <w:szCs w:val="24"/>
+        </w:rPr>
+        <w:t>Para que una herramienta administrativa sea accesible sin necesidad de instalar hardware especializado, se recurre a la ingeniería de software basada en entornos web.</w:t>
+      </w:r>
+    </w:p>
+    <w:p>
+      <w:pPr>
+        <w:rPr>
+          <w:rFonts w:cs="Arial"/>
+          <w:szCs w:val="24"/>
+        </w:rPr>
+      </w:pPr>
+      <w:r>
+        <w:rPr>
+          <w:rFonts w:cs="Arial"/>
+          <w:szCs w:val="24"/>
+        </w:rPr>
+        <w:t>* Arquitectura Cliente-Servidor: Es un modelo de distribución de software donde las tareas se reparten entre los proveedores de recursos o servicios (servidores) y los demandantes (clientes). En una aplicación web, el cliente es el navegador del usuario (que renderiza la interfaz) y el servidor es el encargado de procesar la lógica de negocio y gestionar los accesos a la información.</w:t>
+      </w:r>
+    </w:p>
+    <w:p>
+      <w:pPr>
+        <w:rPr>
+          <w:rFonts w:cs="Arial"/>
+          <w:szCs w:val="24"/>
+        </w:rPr>
+      </w:pPr>
+      <w:r>
+        <w:rPr>
+          <w:rFonts w:cs="Arial"/>
+          <w:szCs w:val="24"/>
+        </w:rPr>
+        <w:t>* Sistemas de Gestión de Bases de Datos Relacionales (SGBDR): Consisten en programas diseñados para definir, estructurar, proteger y manipular bases de datos mediante tablas interconectadas por claves relacionales. El uso de un SGBDR garantiza la integridad referencial, asegurando que cada movimiento de stock quede vinculado de forma exacta a un producto registrado, eliminando el error humano derivado del almacenamiento manual.</w:t>
+      </w:r>
+    </w:p>
+    <w:p>
+      <w:pPr>
+        <w:rPr>
+          <w:rFonts w:cs="Arial"/>
+          <w:szCs w:val="24"/>
+        </w:rPr>
+      </w:pPr>
+      <w:r>
+        <w:rPr>
+          <w:rFonts w:cs="Arial"/>
+          <w:szCs w:val="24"/>
+        </w:rPr>
+        <w:lastRenderedPageBreak/>
+        <w:t>1.4. Ciclo de Vida y Metodologías de Desarrollo de Software</w:t>
+      </w:r>
+    </w:p>
+    <w:p>
+      <w:pPr>
+        <w:rPr>
+          <w:rFonts w:cs="Arial"/>
+          <w:szCs w:val="24"/>
+        </w:rPr>
+      </w:pPr>
+      <w:r>
+        <w:rPr>
+          <w:rFonts w:cs="Arial"/>
+          <w:szCs w:val="24"/>
+        </w:rPr>
+        <w:t>La construcción de un sistema web demanda un enfoque metódico para asegurar que el producto final cumpla de forma estricta con los alcances delimitados. Las metodologías de desarrollo proporcionan la estructura organizativa para las fases de análisis de requisitos, diseño de interfaces, codificación, pruebas de errores e implantación. La adopción de metodologías ágiles o de ciclos incrementales permite un desarrollo escalable, adaptando las interfaces administrativas a las capacidades operativas del usuario final en la boutique.</w:t>
+      </w:r>
+    </w:p>
+    <w:p>
+      <w:pPr>
+        <w:pStyle w:val="NormalWeb"/>
+        <w:rPr>
+          <w:rFonts w:ascii="Arial" w:hAnsi="Arial" w:cs="Arial"/>
+          <w:lang w:eastAsia="es-MX"/>
+        </w:rPr>
+      </w:pPr>
+      <w:r>
+        <w:rPr>
+          <w:rFonts w:ascii="Arial" w:hAnsi="Arial" w:cs="Arial"/>
+        </w:rPr>
+        <w:t xml:space="preserve">1.5. </w:t>
+      </w:r>
+      <w:r>
+        <w:rPr>
+          <w:rFonts w:ascii="Arial" w:hAnsi="Arial" w:cs="Arial"/>
+        </w:rPr>
+        <w:t>El patrón Modelo-Vista-Controlador (MVC) es un modelo de arquitectura de software que separa los datos y la lógica de negocio de una aplicación de su interfaz de usuario y del módulo encargado de gestionar los eventos y las comunicaciones. Esta separación de responsabilidades facilita el desarrollo escalable, el mantenimiento del código fuente y la seguridad del sistema, organizando la aplicación en tres componentes interconectados:</w:t>
+      </w:r>
+    </w:p>
+    <w:p>
+      <w:pPr>
+        <w:pStyle w:val="NormalWeb"/>
+        <w:numPr>
+          <w:ilvl w:val="0"/>
+          <w:numId w:val="50"/>
+        </w:numPr>
+        <w:rPr>
+          <w:rFonts w:ascii="Arial" w:hAnsi="Arial" w:cs="Arial"/>
+        </w:rPr>
+      </w:pPr>
+      <w:r>
+        <w:rPr>
+          <w:rFonts w:ascii="Arial" w:hAnsi="Arial" w:cs="Arial"/>
+          <w:bCs/>
+        </w:rPr>
+        <w:t>Modelo (Model):</w:t>
+      </w:r>
+      <w:r>
+        <w:rPr>
+          <w:rFonts w:ascii="Arial" w:hAnsi="Arial" w:cs="Arial"/>
+        </w:rPr>
+        <w:t xml:space="preserve"> Es la capa encargada de gestionar de forma directa la lógica de negocio, las reglas de la aplicación y el acceso a los datos. Es independiente de la interfaz de usuario y se comunica con la base de datos para ejecutar las operaciones de inserción, consulta, actualización y eliminación (CRUD). En el presente proyecto, el Modelo se implementa a través de las consultas a la base de datos relacional MySQL.</w:t>
+      </w:r>
+    </w:p>
+    <w:p>
+      <w:pPr>
+        <w:pStyle w:val="NormalWeb"/>
+        <w:numPr>
+          <w:ilvl w:val="0"/>
+          <w:numId w:val="50"/>
+        </w:numPr>
+        <w:rPr>
+          <w:rFonts w:ascii="Arial" w:hAnsi="Arial" w:cs="Arial"/>
+        </w:rPr>
+      </w:pPr>
+      <w:r>
+        <w:rPr>
+          <w:rFonts w:ascii="Arial" w:hAnsi="Arial" w:cs="Arial"/>
+          <w:bCs/>
+        </w:rPr>
+        <w:t>Vista (View):</w:t>
+      </w:r>
+      <w:r>
+        <w:rPr>
+          <w:rFonts w:ascii="Arial" w:hAnsi="Arial" w:cs="Arial"/>
+        </w:rPr>
+        <w:t xml:space="preserve"> Representa la interfaz visual y de presentación con la que interactúa el administrador del sistema. Su función es desplegar en pantalla la información proveniente del Modelo y capturar las peticiones o eventos desencadenados por el usuario (como el envío de un formulario de registro). En la boutique, la Vista está desarrollada e integrada con tecnologías del lado del cliente (Frontend), específicamente HTML, CSS y JavaScript.</w:t>
+      </w:r>
+    </w:p>
+    <w:p>
+      <w:pPr>
+        <w:pStyle w:val="NormalWeb"/>
+        <w:numPr>
+          <w:ilvl w:val="0"/>
+          <w:numId w:val="50"/>
+        </w:numPr>
+        <w:rPr>
+          <w:rFonts w:ascii="Arial" w:hAnsi="Arial" w:cs="Arial"/>
+        </w:rPr>
+      </w:pPr>
+      <w:r>
+        <w:rPr>
+          <w:rFonts w:ascii="Arial" w:hAnsi="Arial" w:cs="Arial"/>
+          <w:bCs/>
+        </w:rPr>
+        <w:t>Controlador (Controller):</w:t>
+      </w:r>
+      <w:r>
+        <w:rPr>
+          <w:rFonts w:ascii="Arial" w:hAnsi="Arial" w:cs="Arial"/>
+        </w:rPr>
+        <w:t xml:space="preserve"> Actúa como el intermediario lógico entre la Vista y el Modelo. Su responsabilidad es recibir las peticiones HTTP que el usuario realiza desde la Vista, procesarlas, invocar al Modelo para interactuar con la base de datos si es necesario, y finalmente retornar una respuesta a la Vista para que esta se actualice. En la arquitectura de este sistema web, el lenguaje PHP cumple el rol de Controlador, validando los datos y coordinando el flujo de información de manera transparente y segura.</w:t>
+      </w:r>
+    </w:p>
+    <w:p>
+      <w:pPr>
+        <w:rPr>
+          <w:rFonts w:cs="Arial"/>
+          <w:szCs w:val="24"/>
+        </w:rPr>
+      </w:pPr>
+      <w:r>
+        <w:rPr>
+          <w:rFonts w:cs="Arial"/>
+          <w:szCs w:val="24"/>
+        </w:rPr>
+        <w:t>Tecnologías de Desarrollo Web (Stack Tecnológico)</w:t>
+      </w:r>
+    </w:p>
+    <w:p>
+      <w:pPr>
+        <w:rPr>
+          <w:rFonts w:cs="Arial"/>
+          <w:szCs w:val="24"/>
+        </w:rPr>
+      </w:pPr>
+      <w:r>
+        <w:rPr>
+          <w:rFonts w:cs="Arial"/>
+          <w:szCs w:val="24"/>
+        </w:rPr>
+        <w:t>Para la construcción del sistema de gestión de productos de chabelitaStorepy-Boutique, se ha seleccionado un conjunto de tecnologías estándar de la industria web, las cuales se dividen en herramientas para el desarrollo de la interfaz de usuario (Frontend) y herramientas para la lógica de negocio y persistencia de datos (Backend y Base de Datos).</w:t>
+      </w:r>
+    </w:p>
+    <w:p>
+      <w:pPr>
+        <w:rPr>
+          <w:rFonts w:cs="Arial"/>
+          <w:szCs w:val="24"/>
+        </w:rPr>
+      </w:pPr>
+      <w:r>
+        <w:rPr>
+          <w:rFonts w:cs="Arial"/>
+          <w:szCs w:val="24"/>
+        </w:rPr>
+        <w:t xml:space="preserve"> Tecnologías de Frontend (Interfaz de Usuario)</w:t>
+      </w:r>
+    </w:p>
+    <w:p>
+      <w:pPr>
+        <w:rPr>
+          <w:rFonts w:cs="Arial"/>
+          <w:szCs w:val="24"/>
+        </w:rPr>
+      </w:pPr>
+      <w:r>
+        <w:rPr>
+          <w:rFonts w:cs="Arial"/>
+          <w:szCs w:val="24"/>
+        </w:rPr>
+        <w:lastRenderedPageBreak/>
+        <w:t>* HTML (HyperText Markup Language): Es el lenguaje de marcado estándar utilizado para estructurar el contenido de las páginas web. En el sistema, HTML se encargará de definir los elementos visuales esenciales, tales como los formularios de registro de productos, las tablas de visualización de stock y los botones de acción para modificar o eliminar artículos.</w:t>
+      </w:r>
+    </w:p>
+    <w:p>
+      <w:pPr>
+        <w:rPr>
+          <w:rFonts w:cs="Arial"/>
+          <w:szCs w:val="24"/>
+        </w:rPr>
+      </w:pPr>
+      <w:r>
+        <w:rPr>
+          <w:rFonts w:cs="Arial"/>
+          <w:szCs w:val="24"/>
+        </w:rPr>
+        <w:t>* CSS (Cascading Style Sheets): Es el lenguaje de diseño encargado de aplicar estilos, layouts y formatos visuales a la estructura HTML. Su implementación es clave para garantizar una interfaz de usuario limpia, intuitiva y organizada, permitiendo que la administración de la boutique visualice las alertas de stock de manera clara y sin saturación visual.</w:t>
+      </w:r>
+    </w:p>
+    <w:p>
+      <w:pPr>
+        <w:rPr>
+          <w:rFonts w:cs="Arial"/>
+          <w:szCs w:val="24"/>
+        </w:rPr>
+      </w:pPr>
+      <w:r>
+        <w:rPr>
+          <w:rFonts w:cs="Arial"/>
+          <w:szCs w:val="24"/>
+        </w:rPr>
+        <w:t>* JavaScript: Es un lenguaje de programación interpretado que se ejecuta en el navegador del cliente. Su propósito en este proyecto es dotar de dinamismo e interactividad a la plataforma, permitiendo la validación de formularios en tiempo real (por ejemplo, evitar que se ingresen precios negativos) y la actualización de datos en pantalla sin necesidad de recargar la página por completo.</w:t>
+      </w:r>
+    </w:p>
+    <w:p>
+      <w:pPr>
+        <w:rPr>
+          <w:rFonts w:cs="Arial"/>
+          <w:szCs w:val="24"/>
+        </w:rPr>
+      </w:pPr>
+      <w:r>
+        <w:rPr>
+          <w:rFonts w:cs="Arial"/>
+          <w:szCs w:val="24"/>
+        </w:rPr>
+        <w:t xml:space="preserve"> Tecnologías de Backend y Almacenamiento</w:t>
+      </w:r>
+    </w:p>
+    <w:p>
+      <w:pPr>
+        <w:rPr>
+          <w:rFonts w:cs="Arial"/>
+          <w:szCs w:val="24"/>
+        </w:rPr>
+      </w:pPr>
+      <w:r>
+        <w:rPr>
+          <w:rFonts w:cs="Arial"/>
+          <w:szCs w:val="24"/>
+        </w:rPr>
+        <w:t>*</w:t>
+      </w:r>
+      <w:r>
+        <w:rPr>
+          <w:rFonts w:cs="Arial"/>
+          <w:szCs w:val="24"/>
+        </w:rPr>
+        <w:t xml:space="preserve"> PHP (Hypertext Preprocessor</w:t>
+      </w:r>
+      <w:bookmarkStart w:id="1" w:name="_GoBack"/>
+      <w:bookmarkEnd w:id="1"/>
+      <w:r>
+        <w:rPr>
+          <w:rFonts w:cs="Arial"/>
+          <w:szCs w:val="24"/>
+        </w:rPr>
+        <w:t xml:space="preserve">): Es un lenguaje de programación de código abierto especialmente diseñado para el desarrollo de software del lado del servidor. PHP actuará como el motor lógico del sistema, encargándose de recibir las solicitudes del navegador de la boutique, </w:t>
+      </w:r>
+      <w:r>
+        <w:rPr>
+          <w:rFonts w:cs="Arial"/>
+          <w:szCs w:val="24"/>
+        </w:rPr>
+        <w:t>procesar</w:t>
+      </w:r>
+      <w:r>
+        <w:rPr>
+          <w:rFonts w:cs="Arial"/>
+          <w:szCs w:val="24"/>
+        </w:rPr>
+        <w:t xml:space="preserve"> las operaciones CRUD, aplicar las reglas de negocio para la detección de productos que necesitan reposición y establecer la comunicación segura con el servidor de datos.</w:t>
+      </w:r>
+    </w:p>
+    <w:p>
+      <w:pPr>
+        <w:rPr>
+          <w:rFonts w:cs="Arial"/>
+          <w:szCs w:val="24"/>
+        </w:rPr>
+      </w:pPr>
+      <w:r>
+        <w:rPr>
+          <w:rFonts w:cs="Arial"/>
+          <w:szCs w:val="24"/>
+        </w:rPr>
+        <w:t>* MySQL: Es un Sistema de Gestión de Bases de Datos Relacionales (SGBDR) basado en el lenguaje de consulta estructurado SQL. MySQL se utilizará para almacenar de forma persistente, eficiente y organizada toda la información de la boutique. La base de datos contará con tablas relacionales donde se guardarán los atributos de los productos (nombres, precios, categorías, talles) y los niveles de existencias corrientes, garantizando la integridad de los datos y previniendo la duplicación o pérdida de registros informáticos.</w:t>
+      </w:r>
+    </w:p>
+    <w:p>
+      <w:pPr>
+        <w:rPr>
+          <w:rFonts w:cs="Arial"/>
+          <w:szCs w:val="24"/>
+        </w:rPr>
+      </w:pPr>
+      <w:r>
+        <w:rPr>
+          <w:rFonts w:cs="Arial"/>
+          <w:szCs w:val="24"/>
+        </w:rPr>
+        <w:t>Integración y Flujo de Funcionamiento del Sistema Web</w:t>
+      </w:r>
+    </w:p>
+    <w:p>
+      <w:pPr>
+        <w:rPr>
+          <w:rFonts w:cs="Arial"/>
+          <w:szCs w:val="24"/>
+        </w:rPr>
+      </w:pPr>
+      <w:r>
+        <w:rPr>
+          <w:rFonts w:cs="Arial"/>
+          <w:szCs w:val="24"/>
+        </w:rPr>
+        <w:t>Para la gestión de productos en la boutique, las tecnologías seleccionadas interactúan de forma cíclica y coordinada bajo el modelo de arquitectura web de tres capas:</w:t>
+      </w:r>
+    </w:p>
+    <w:p>
+      <w:pPr>
+        <w:rPr>
+          <w:rFonts w:cs="Arial"/>
+          <w:szCs w:val="24"/>
+        </w:rPr>
+      </w:pPr>
+      <w:r>
+        <w:rPr>
+          <w:rFonts w:cs="Arial"/>
+          <w:szCs w:val="24"/>
+        </w:rPr>
+        <w:t>1. Capa de Presentación (Frontend): El usuario interactúa con la interfaz visual construida en HTML y CSS. Al intentar registrar o modificar un producto, JavaScript valida localmente en el navegador que los campos estén completos y correctos, optimizando el tiempo de respuesta.</w:t>
+      </w:r>
+    </w:p>
+    <w:p>
+      <w:pPr>
+        <w:rPr>
+          <w:rFonts w:cs="Arial"/>
+          <w:szCs w:val="24"/>
+        </w:rPr>
+      </w:pPr>
+      <w:r>
+        <w:rPr>
+          <w:rFonts w:cs="Arial"/>
+          <w:szCs w:val="24"/>
+        </w:rPr>
+        <w:t>2. Capa de Lógica de Negocio (Backend): Una vez validados los datos, la solicitud es enviada al servidor, donde PHP recibe la información, la procesa y ejecuta las reglas del negocio (como calcular si el stock actual está por debajo del límite mínimo para activar una alerta de reposición).</w:t>
+      </w:r>
+    </w:p>
+    <w:p>
+      <w:pPr>
+        <w:rPr>
+          <w:rFonts w:cs="Arial"/>
+          <w:szCs w:val="24"/>
+        </w:rPr>
+      </w:pPr>
+      <w:r>
+        <w:rPr>
+          <w:rFonts w:cs="Arial"/>
+          <w:szCs w:val="24"/>
+        </w:rPr>
+        <w:lastRenderedPageBreak/>
+        <w:t>3. Capa de Datos (Base de Datos): PHP se comunica con MySQL enviando una consulta estructurada (SQL) para insertar, actualizar, consultar o dar de baja el registro en las tablas correspondientes. Finalmente, la base de datos devuelve una respuesta que realiza el camino inverso hasta mostrarse en la pantalla del usuario.</w:t>
       </w:r>
     </w:p>
     <w:p>
@@ -1514,7 +2165,55 @@
           <w:rFonts w:cs="Arial"/>
           <w:szCs w:val="24"/>
         </w:rPr>
-        <w:t>// Se coloca los aspectos legales aquí </w:t>
+        <w:t>El desarrollo e implementación del sistema web para chabelitaStorepy-Boutique se rige de manera estricta bajo el marco jurídico vigente de la República del Paraguay, considerando las normativas que regulan la tecnología, el comercio y la propiedad intelectual:</w:t>
+      </w:r>
+    </w:p>
+    <w:p>
+      <w:pPr>
+        <w:rPr>
+          <w:rFonts w:cs="Arial"/>
+          <w:szCs w:val="24"/>
+        </w:rPr>
+      </w:pPr>
+      <w:r>
+        <w:rPr>
+          <w:rFonts w:cs="Arial"/>
+          <w:szCs w:val="24"/>
+        </w:rPr>
+        <w:t xml:space="preserve">* Ley N° 6534/20 "De Protección de Datos Personales en Paraguay": </w:t>
+      </w:r>
+      <w:r>
+        <w:t>Esta ley regula la privacidad y el tratamiento de los datos personales. En el sistema propuesto, su aplicación es de carácter obligatorio, ya que se implementará un módulo para el registro de clientes (almacenando nombres y números de teléfono). El sistema garantizará que esta información sea de uso estrictamente interno para la gestión de la boutique, asegurando la confidencialidad de los datos de terceros y protegiendo las credenciales de acceso de los administradores mediante técnicas de encriptación.</w:t>
+      </w:r>
+    </w:p>
+    <w:p>
+      <w:pPr>
+        <w:rPr>
+          <w:rFonts w:cs="Arial"/>
+          <w:szCs w:val="24"/>
+        </w:rPr>
+      </w:pPr>
+      <w:r>
+        <w:rPr>
+          <w:rFonts w:cs="Arial"/>
+          <w:szCs w:val="24"/>
+        </w:rPr>
+        <w:t>* Ley N° 4868/13 "De Comercio Electrónico": Aunque el sistema web desarrollado es de uso estrictamente interno para la administración de inventario y no para la venta directa al público en línea, la normativa establece los estándares de seguridad informática y buenas prácticas en plataformas digitales comerciales dentro del país, los cuales serán tomados como referencia para el diseño técnico del software.</w:t>
+      </w:r>
+    </w:p>
+    <w:p>
+      <w:pPr>
+        <w:rPr>
+          <w:rFonts w:cs="Arial"/>
+          <w:szCs w:val="24"/>
+        </w:rPr>
+      </w:pPr>
+      <w:r>
+        <w:rPr>
+          <w:rFonts w:cs="Arial"/>
+          <w:szCs w:val="24"/>
+        </w:rPr>
+        <w:t>* Ley N° 1328/98 "De Derecho de Autor y Derechos Conexos": Esta legislación ampara la propiedad intelectual de las creaciones de software y bases de datos en Paraguay. El código fuente, la estructura de la base de datos en MySQL y el diseño de la interfaz desarrollados para este Trabajo Final de Grado pertenecen legalmente a sus autores (José Damián Amarilla Vázquez y Marcelo Javier Antúnez Ruiz Díaz), bajo el respaldo académico de la Universidad del Norte.</w:t>
       </w:r>
     </w:p>
     <w:p>
@@ -2146,25 +2845,7 @@
           <w:szCs w:val="24"/>
           <w:lang w:val="en-US"/>
         </w:rPr>
-        <w:t xml:space="preserve">“Differential effects of spot blotch on photosynthesis and grain yield in two barley cultivars,” “European journal of plant pathology,” vol. 139, no. 3, pp. 471-480, </w:t>
-      </w:r>
-      <w:proofErr w:type="spellStart"/>
-      <w:r>
-        <w:rPr>
-          <w:rFonts w:cs="Arial"/>
-          <w:szCs w:val="24"/>
-          <w:lang w:val="en-US"/>
-        </w:rPr>
-        <w:t>Junio</w:t>
-      </w:r>
-      <w:proofErr w:type="spellEnd"/>
-      <w:r>
-        <w:rPr>
-          <w:rFonts w:cs="Arial"/>
-          <w:szCs w:val="24"/>
-          <w:lang w:val="en-US"/>
-        </w:rPr>
-        <w:t xml:space="preserve"> 2014.</w:t>
+        <w:t>“Differential effects of spot blotch on photosynthesis and grain yield in two barley cultivars,” “European journal of plant pathology,” vol. 139, no. 3, pp. 471-480, Junio 2014.</w:t>
       </w:r>
     </w:p>
     <w:p>
@@ -6636,6 +7317,156 @@
     </w:lvl>
   </w:abstractNum>
   <w:abstractNum w:abstractNumId="37">
+    <w:nsid w:val="640C7BB3"/>
+    <w:multiLevelType w:val="multilevel"/>
+    <w:tmpl w:val="E11203B4"/>
+    <w:lvl w:ilvl="0">
+      <w:start w:val="1"/>
+      <w:numFmt w:val="bullet"/>
+      <w:lvlText w:val=""/>
+      <w:lvlJc w:val="left"/>
+      <w:pPr>
+        <w:tabs>
+          <w:tab w:val="num" w:pos="720"/>
+        </w:tabs>
+        <w:ind w:left="720" w:hanging="360"/>
+      </w:pPr>
+      <w:rPr>
+        <w:rFonts w:ascii="Symbol" w:hAnsi="Symbol" w:hint="default"/>
+        <w:b w:val="0"/>
+        <w:sz w:val="20"/>
+      </w:rPr>
+    </w:lvl>
+    <w:lvl w:ilvl="1" w:tentative="1">
+      <w:start w:val="1"/>
+      <w:numFmt w:val="bullet"/>
+      <w:lvlText w:val="o"/>
+      <w:lvlJc w:val="left"/>
+      <w:pPr>
+        <w:tabs>
+          <w:tab w:val="num" w:pos="1440"/>
+        </w:tabs>
+        <w:ind w:left="1440" w:hanging="360"/>
+      </w:pPr>
+      <w:rPr>
+        <w:rFonts w:ascii="Courier New" w:hAnsi="Courier New" w:hint="default"/>
+        <w:sz w:val="20"/>
+      </w:rPr>
+    </w:lvl>
+    <w:lvl w:ilvl="2" w:tentative="1">
+      <w:start w:val="1"/>
+      <w:numFmt w:val="bullet"/>
+      <w:lvlText w:val=""/>
+      <w:lvlJc w:val="left"/>
+      <w:pPr>
+        <w:tabs>
+          <w:tab w:val="num" w:pos="2160"/>
+        </w:tabs>
+        <w:ind w:left="2160" w:hanging="360"/>
+      </w:pPr>
+      <w:rPr>
+        <w:rFonts w:ascii="Wingdings" w:hAnsi="Wingdings" w:hint="default"/>
+        <w:sz w:val="20"/>
+      </w:rPr>
+    </w:lvl>
+    <w:lvl w:ilvl="3" w:tentative="1">
+      <w:start w:val="1"/>
+      <w:numFmt w:val="bullet"/>
+      <w:lvlText w:val=""/>
+      <w:lvlJc w:val="left"/>
+      <w:pPr>
+        <w:tabs>
+          <w:tab w:val="num" w:pos="2880"/>
+        </w:tabs>
+        <w:ind w:left="2880" w:hanging="360"/>
+      </w:pPr>
+      <w:rPr>
+        <w:rFonts w:ascii="Wingdings" w:hAnsi="Wingdings" w:hint="default"/>
+        <w:sz w:val="20"/>
+      </w:rPr>
+    </w:lvl>
+    <w:lvl w:ilvl="4" w:tentative="1">
+      <w:start w:val="1"/>
+      <w:numFmt w:val="bullet"/>
+      <w:lvlText w:val=""/>
+      <w:lvlJc w:val="left"/>
+      <w:pPr>
+        <w:tabs>
+          <w:tab w:val="num" w:pos="3600"/>
+        </w:tabs>
+        <w:ind w:left="3600" w:hanging="360"/>
+      </w:pPr>
+      <w:rPr>
+        <w:rFonts w:ascii="Wingdings" w:hAnsi="Wingdings" w:hint="default"/>
+        <w:sz w:val="20"/>
+      </w:rPr>
+    </w:lvl>
+    <w:lvl w:ilvl="5" w:tentative="1">
+      <w:start w:val="1"/>
+      <w:numFmt w:val="bullet"/>
+      <w:lvlText w:val=""/>
+      <w:lvlJc w:val="left"/>
+      <w:pPr>
+        <w:tabs>
+          <w:tab w:val="num" w:pos="4320"/>
+        </w:tabs>
+        <w:ind w:left="4320" w:hanging="360"/>
+      </w:pPr>
+      <w:rPr>
+        <w:rFonts w:ascii="Wingdings" w:hAnsi="Wingdings" w:hint="default"/>
+        <w:sz w:val="20"/>
+      </w:rPr>
+    </w:lvl>
+    <w:lvl w:ilvl="6" w:tentative="1">
+      <w:start w:val="1"/>
+      <w:numFmt w:val="bullet"/>
+      <w:lvlText w:val=""/>
+      <w:lvlJc w:val="left"/>
+      <w:pPr>
+        <w:tabs>
+          <w:tab w:val="num" w:pos="5040"/>
+        </w:tabs>
+        <w:ind w:left="5040" w:hanging="360"/>
+      </w:pPr>
+      <w:rPr>
+        <w:rFonts w:ascii="Wingdings" w:hAnsi="Wingdings" w:hint="default"/>
+        <w:sz w:val="20"/>
+      </w:rPr>
+    </w:lvl>
+    <w:lvl w:ilvl="7" w:tentative="1">
+      <w:start w:val="1"/>
+      <w:numFmt w:val="bullet"/>
+      <w:lvlText w:val=""/>
+      <w:lvlJc w:val="left"/>
+      <w:pPr>
+        <w:tabs>
+          <w:tab w:val="num" w:pos="5760"/>
+        </w:tabs>
+        <w:ind w:left="5760" w:hanging="360"/>
+      </w:pPr>
+      <w:rPr>
+        <w:rFonts w:ascii="Wingdings" w:hAnsi="Wingdings" w:hint="default"/>
+        <w:sz w:val="20"/>
+      </w:rPr>
+    </w:lvl>
+    <w:lvl w:ilvl="8" w:tentative="1">
+      <w:start w:val="1"/>
+      <w:numFmt w:val="bullet"/>
+      <w:lvlText w:val=""/>
+      <w:lvlJc w:val="left"/>
+      <w:pPr>
+        <w:tabs>
+          <w:tab w:val="num" w:pos="6480"/>
+        </w:tabs>
+        <w:ind w:left="6480" w:hanging="360"/>
+      </w:pPr>
+      <w:rPr>
+        <w:rFonts w:ascii="Wingdings" w:hAnsi="Wingdings" w:hint="default"/>
+        <w:sz w:val="20"/>
+      </w:rPr>
+    </w:lvl>
+  </w:abstractNum>
+  <w:abstractNum w:abstractNumId="38">
     <w:nsid w:val="6A353393"/>
     <w:multiLevelType w:val="hybridMultilevel"/>
     <w:tmpl w:val="D2E88558"/>
@@ -6724,7 +7555,7 @@
       </w:pPr>
     </w:lvl>
   </w:abstractNum>
-  <w:abstractNum w:abstractNumId="38">
+  <w:abstractNum w:abstractNumId="39">
     <w:nsid w:val="6D301071"/>
     <w:multiLevelType w:val="hybridMultilevel"/>
     <w:tmpl w:val="E4CCFCC8"/>
@@ -6837,7 +7668,7 @@
       </w:rPr>
     </w:lvl>
   </w:abstractNum>
-  <w:abstractNum w:abstractNumId="39">
+  <w:abstractNum w:abstractNumId="40">
     <w:nsid w:val="6DAE6B6F"/>
     <w:multiLevelType w:val="hybridMultilevel"/>
     <w:tmpl w:val="71368AC4"/>
@@ -6928,7 +7759,7 @@
       </w:pPr>
     </w:lvl>
   </w:abstractNum>
-  <w:abstractNum w:abstractNumId="40">
+  <w:abstractNum w:abstractNumId="41">
     <w:nsid w:val="6FD80F43"/>
     <w:multiLevelType w:val="hybridMultilevel"/>
     <w:tmpl w:val="6A0A9ED2"/>
@@ -7041,7 +7872,7 @@
       </w:rPr>
     </w:lvl>
   </w:abstractNum>
-  <w:abstractNum w:abstractNumId="41">
+  <w:abstractNum w:abstractNumId="42">
     <w:nsid w:val="703F771E"/>
     <w:multiLevelType w:val="hybridMultilevel"/>
     <w:tmpl w:val="CF824F86"/>
@@ -7153,7 +7984,7 @@
       </w:rPr>
     </w:lvl>
   </w:abstractNum>
-  <w:abstractNum w:abstractNumId="42">
+  <w:abstractNum w:abstractNumId="43">
     <w:nsid w:val="70F3587B"/>
     <w:multiLevelType w:val="hybridMultilevel"/>
     <w:tmpl w:val="80F497F0"/>
@@ -7266,7 +8097,7 @@
       </w:rPr>
     </w:lvl>
   </w:abstractNum>
-  <w:abstractNum w:abstractNumId="43">
+  <w:abstractNum w:abstractNumId="44">
     <w:nsid w:val="71257075"/>
     <w:multiLevelType w:val="hybridMultilevel"/>
     <w:tmpl w:val="ED9E4C8A"/>
@@ -7379,7 +8210,7 @@
       </w:rPr>
     </w:lvl>
   </w:abstractNum>
-  <w:abstractNum w:abstractNumId="44">
+  <w:abstractNum w:abstractNumId="45">
     <w:nsid w:val="75C14CC8"/>
     <w:multiLevelType w:val="multilevel"/>
     <w:tmpl w:val="EF74E092"/>
@@ -7500,7 +8331,7 @@
       </w:pPr>
     </w:lvl>
   </w:abstractNum>
-  <w:abstractNum w:abstractNumId="45">
+  <w:abstractNum w:abstractNumId="46">
     <w:nsid w:val="77391D97"/>
     <w:multiLevelType w:val="hybridMultilevel"/>
     <w:tmpl w:val="DFF659A0"/>
@@ -7586,7 +8417,7 @@
       </w:pPr>
     </w:lvl>
   </w:abstractNum>
-  <w:abstractNum w:abstractNumId="46">
+  <w:abstractNum w:abstractNumId="47">
     <w:nsid w:val="79C6720E"/>
     <w:multiLevelType w:val="hybridMultilevel"/>
     <w:tmpl w:val="9110A900"/>
@@ -7699,7 +8530,7 @@
       </w:rPr>
     </w:lvl>
   </w:abstractNum>
-  <w:abstractNum w:abstractNumId="47">
+  <w:abstractNum w:abstractNumId="48">
     <w:nsid w:val="7D463819"/>
     <w:multiLevelType w:val="hybridMultilevel"/>
     <w:tmpl w:val="87485E6E"/>
@@ -7812,7 +8643,7 @@
       </w:rPr>
     </w:lvl>
   </w:abstractNum>
-  <w:abstractNum w:abstractNumId="48">
+  <w:abstractNum w:abstractNumId="49">
     <w:nsid w:val="7D9C0FAD"/>
     <w:multiLevelType w:val="multilevel"/>
     <w:tmpl w:val="4462CA1A"/>
@@ -7822,7 +8653,7 @@
     <w:abstractNumId w:val="15"/>
   </w:num>
   <w:num w:numId="2">
-    <w:abstractNumId w:val="44"/>
+    <w:abstractNumId w:val="45"/>
   </w:num>
   <w:num w:numId="3">
     <w:abstractNumId w:val="36"/>
@@ -7837,7 +8668,7 @@
     <w:abstractNumId w:val="31"/>
   </w:num>
   <w:num w:numId="7">
-    <w:abstractNumId w:val="48"/>
+    <w:abstractNumId w:val="49"/>
   </w:num>
   <w:num w:numId="8">
     <w:abstractNumId w:val="9"/>
@@ -7858,10 +8689,10 @@
     <w:abstractNumId w:val="23"/>
   </w:num>
   <w:num w:numId="14">
-    <w:abstractNumId w:val="41"/>
+    <w:abstractNumId w:val="42"/>
   </w:num>
   <w:num w:numId="15">
-    <w:abstractNumId w:val="43"/>
+    <w:abstractNumId w:val="44"/>
   </w:num>
   <w:num w:numId="16">
     <w:abstractNumId w:val="34"/>
@@ -7897,7 +8728,7 @@
     <w:abstractNumId w:val="3"/>
   </w:num>
   <w:num w:numId="18">
-    <w:abstractNumId w:val="47"/>
+    <w:abstractNumId w:val="48"/>
   </w:num>
   <w:num w:numId="19">
     <w:abstractNumId w:val="20"/>
@@ -7933,7 +8764,7 @@
     <w:abstractNumId w:val="29"/>
   </w:num>
   <w:num w:numId="30">
-    <w:abstractNumId w:val="40"/>
+    <w:abstractNumId w:val="41"/>
   </w:num>
   <w:num w:numId="31">
     <w:abstractNumId w:val="10"/>
@@ -7945,7 +8776,7 @@
     <w:abstractNumId w:val="22"/>
   </w:num>
   <w:num w:numId="34">
-    <w:abstractNumId w:val="37"/>
+    <w:abstractNumId w:val="38"/>
   </w:num>
   <w:num w:numId="35">
     <w:abstractNumId w:val="35"/>
@@ -7960,16 +8791,16 @@
     <w:abstractNumId w:val="13"/>
   </w:num>
   <w:num w:numId="39">
-    <w:abstractNumId w:val="38"/>
+    <w:abstractNumId w:val="39"/>
   </w:num>
   <w:num w:numId="40">
-    <w:abstractNumId w:val="46"/>
+    <w:abstractNumId w:val="47"/>
   </w:num>
   <w:num w:numId="41">
     <w:abstractNumId w:val="25"/>
   </w:num>
   <w:num w:numId="42">
-    <w:abstractNumId w:val="42"/>
+    <w:abstractNumId w:val="43"/>
   </w:num>
   <w:num w:numId="43">
     <w:abstractNumId w:val="14"/>
@@ -7978,7 +8809,7 @@
     <w:abstractNumId w:val="1"/>
   </w:num>
   <w:num w:numId="45">
-    <w:abstractNumId w:val="39"/>
+    <w:abstractNumId w:val="40"/>
   </w:num>
   <w:num w:numId="46">
     <w:abstractNumId w:val="32"/>
@@ -7990,7 +8821,10 @@
     <w:abstractNumId w:val="18"/>
   </w:num>
   <w:num w:numId="49">
-    <w:abstractNumId w:val="45"/>
+    <w:abstractNumId w:val="46"/>
+  </w:num>
+  <w:num w:numId="50">
+    <w:abstractNumId w:val="37"/>
   </w:num>
 </w:numbering>
 </file>
@@ -9124,7 +9958,6 @@
     <w:name w:val="Normal (Web)"/>
     <w:basedOn w:val="Normal"/>
     <w:uiPriority w:val="99"/>
-    <w:semiHidden/>
     <w:unhideWhenUsed/>
     <w:rsid w:val="00365C6D"/>
     <w:pPr>
@@ -9488,8 +10321,8 @@
       <w:vertAlign w:val="superscript"/>
     </w:rPr>
   </w:style>
-  <w:style w:type="character" w:customStyle="1" w:styleId="UnresolvedMention">
-    <w:name w:val="Unresolved Mention"/>
+  <w:style w:type="character" w:customStyle="1" w:styleId="Mencinsinresolver1">
+    <w:name w:val="Mención sin resolver1"/>
     <w:basedOn w:val="Fuentedeprrafopredeter"/>
     <w:uiPriority w:val="99"/>
     <w:semiHidden/>
@@ -9833,7 +10666,7 @@
 </file>
 
 <file path=customXml/itemProps1.xml><?xml version="1.0" encoding="utf-8"?>
-<ds:datastoreItem xmlns:ds="http://schemas.openxmlformats.org/officeDocument/2006/customXml" ds:itemID="{D1D22482-1057-4ED6-99A9-E5FF3529C1F0}">
+<ds:datastoreItem xmlns:ds="http://schemas.openxmlformats.org/officeDocument/2006/customXml" ds:itemID="{E7A8BC80-0386-4387-BA93-2B261737D5F1}">
   <ds:schemaRefs>
     <ds:schemaRef ds:uri="http://schemas.openxmlformats.org/officeDocument/2006/bibliography"/>
   </ds:schemaRefs>

</xml_diff>